<commit_message>
Refine procesni_podani template: page breaks and bulleted evidence
- The přílohy block ends its page: the evidence list (when present) is
  preceded by an explicit page break so it gets its own page, and the
  filing text always starts on a fresh page via the vzor's own cover
  section break (no duplicate break, which previously produced an empty
  page).
- In-text evidence is now a "Důkaz:" label paragraph followed by a
  hyphen-bulleted list using the new "Důkazy odrážky" style (italic,
  small, indented under the label) instead of a single indented line;
  text_podani argument description updated accordingly.
- Multi-line address/party placeholders are left-aligned so soft-broken
  lines are not stretched by justification.

Co-Authored-By: Claude Fable 5 <noreply@anthropic.com>
Claude-Session: https://claude.ai/code/session_01SYQSko3quHt3XWKx77E7HS
</commit_message>
<xml_diff>
--- a/custom_templates/procesni_podani_template.docx
+++ b/custom_templates/procesni_podani_template.docx
@@ -643,10 +643,14 @@
         <w:t xml:space="preserve">{{/if}}</w:t>
       </w:r>
     </w:p>
-    <w:p/>
     <w:p>
       <w:r>
         <w:t xml:space="preserve">{{#if ma_dukazy}}</w:t>
+      </w:r>
+    </w:p>
+    <w:p>
+      <w:r>
+        <w:br w:type="page"/>
       </w:r>
     </w:p>
     <w:p>
@@ -8059,6 +8063,18 @@
       <w:i/>
     </w:rPr>
   </w:style>
+  <w:style w:type="paragraph" w:styleId="Dkazyodrazky">
+    <w:name w:val="Důkazy odrážky"/>
+    <w:basedOn w:val="Dkazy"/>
+    <w:semiHidden/>
+    <w:unhideWhenUsed/>
+    <w:pPr>
+      <w:numPr>
+        <w:numId w:val="6"/>
+      </w:numPr>
+      <w:ind w:left="1418" w:hanging="567"/>
+    </w:pPr>
+  </w:style>
 </w:styles>
 </file>
 

</xml_diff>

<commit_message>
Polish procesni_podani cover spacing, quote style and signature
- Cover page: remove the blank paragraphs that reserved space for the
  via-court address block (now part of the {{prostrednictvim}} value)
  and halve the double blank gaps between the head table, sp. zn. and
  the parties table.
- Quote style: deeper symmetric indent (2 cm) with real spacing above
  and below so citations stand apart from numbered paragraphs and
  evidence bullets; argument description now asks for quotation marks
  and placement right after the paragraph the citation belongs to.
- podpis argument: attorney's name only (e.g. "JUDr. Jan Novák,
  advokát"), nothing else.

Co-Authored-By: Claude Fable 5 <noreply@anthropic.com>
Claude-Session: https://claude.ai/code/session_01SYQSko3quHt3XWKx77E7HS
</commit_message>
<xml_diff>
--- a/custom_templates/procesni_podani_template.docx
+++ b/custom_templates/procesni_podani_template.docx
@@ -43,7 +43,6 @@
               <w:t>{{soud}}</w:t>
             </w:r>
           </w:p>
-          <w:p/>
           <w:p>
             <w:pPr>
               <w:jc w:val="left"/>
@@ -57,13 +56,6 @@
               </w:rPr>
               <w:t>{{prostrednictvim}}</w:t>
             </w:r>
-          </w:p>
-          <w:p>
-            <w:pPr>
-              <w:rPr>
-                <w:u w:val="single"/>
-              </w:rPr>
-            </w:pPr>
           </w:p>
           <w:tbl>
             <w:tblPr>
@@ -138,7 +130,6 @@
       </w:tr>
     </w:tbl>
     <w:p/>
-    <w:p/>
     <w:p>
       <w:pPr>
         <w:rPr>
@@ -151,13 +142,6 @@
         </w:rPr>
         <w:t>{{spisova_znacka}}</w:t>
       </w:r>
-    </w:p>
-    <w:p>
-      <w:pPr>
-        <w:rPr>
-          <w:b/>
-        </w:rPr>
-      </w:pPr>
     </w:p>
     <w:p>
       <w:pPr>
@@ -8056,8 +8040,8 @@
     <w:semiHidden/>
     <w:unhideWhenUsed/>
     <w:pPr>
-      <w:spacing w:before="120" w:after="120"/>
-      <w:ind w:left="851" w:right="851"/>
+      <w:spacing w:before="240" w:after="240"/>
+      <w:ind w:left="1134" w:right="1134"/>
     </w:pPr>
     <w:rPr>
       <w:i/>

</xml_diff>

<commit_message>
Drop Quote style from procesni_podani: citations are inline
The vzor never had a block-quote style — citations in filings are
written inline in the numbered paragraph, in quotation marks and
italics. Remove the added Quote style from the template and instruct
the model to write citations as *„citovaný text"* instead of markdown
blockquotes.

Co-Authored-By: Claude Fable 5 <noreply@anthropic.com>
Claude-Session: https://claude.ai/code/session_01SYQSko3quHt3XWKx77E7HS
</commit_message>
<xml_diff>
--- a/custom_templates/procesni_podani_template.docx
+++ b/custom_templates/procesni_podani_template.docx
@@ -8034,19 +8034,6 @@
       <w:spacing w:after="120"/>
     </w:pPr>
   </w:style>
-  <w:style w:type="paragraph" w:styleId="Quote">
-    <w:name w:val="Quote"/>
-    <w:basedOn w:val="Normal"/>
-    <w:semiHidden/>
-    <w:unhideWhenUsed/>
-    <w:pPr>
-      <w:spacing w:before="240" w:after="240"/>
-      <w:ind w:left="1134" w:right="1134"/>
-    </w:pPr>
-    <w:rPr>
-      <w:i/>
-    </w:rPr>
-  </w:style>
   <w:style w:type="paragraph" w:styleId="Dkazyodrazky">
     <w:name w:val="Důkazy odrážky"/>
     <w:basedOn w:val="Dkazy"/>

</xml_diff>

<commit_message>
Keep přílohy at the bottom of page 1 in procesni_podani
The vzor pushed the přílohy block down with 13 blank spacer paragraphs
sized for its one-line [●] placeholders; with realistic multi-line
court/party data the block overflowed to page 2. Keep a single spacer
so the attachment list ends page 1 (the page break to the evidence
list / filing text follows right after it).

Co-Authored-By: Claude Fable 5 <noreply@anthropic.com>
Claude-Session: https://claude.ai/code/session_01SYQSko3quHt3XWKx77E7HS
</commit_message>
<xml_diff>
--- a/custom_templates/procesni_podani_template.docx
+++ b/custom_templates/procesni_podani_template.docx
@@ -471,110 +471,6 @@
         </w:tc>
       </w:tr>
     </w:tbl>
-    <w:p>
-      <w:pPr>
-        <w:autoSpaceDE w:val="0"/>
-        <w:autoSpaceDN w:val="0"/>
-        <w:adjustRightInd w:val="0"/>
-        <w:jc w:val="left"/>
-      </w:pPr>
-    </w:p>
-    <w:p>
-      <w:pPr>
-        <w:autoSpaceDE w:val="0"/>
-        <w:autoSpaceDN w:val="0"/>
-        <w:adjustRightInd w:val="0"/>
-        <w:jc w:val="left"/>
-      </w:pPr>
-    </w:p>
-    <w:p/>
-    <w:p>
-      <w:pPr>
-        <w:autoSpaceDE w:val="0"/>
-        <w:autoSpaceDN w:val="0"/>
-        <w:adjustRightInd w:val="0"/>
-        <w:jc w:val="left"/>
-      </w:pPr>
-    </w:p>
-    <w:p>
-      <w:pPr>
-        <w:autoSpaceDE w:val="0"/>
-        <w:autoSpaceDN w:val="0"/>
-        <w:adjustRightInd w:val="0"/>
-        <w:jc w:val="left"/>
-      </w:pPr>
-    </w:p>
-    <w:p>
-      <w:pPr>
-        <w:autoSpaceDE w:val="0"/>
-        <w:autoSpaceDN w:val="0"/>
-        <w:adjustRightInd w:val="0"/>
-        <w:jc w:val="left"/>
-      </w:pPr>
-    </w:p>
-    <w:p>
-      <w:pPr>
-        <w:autoSpaceDE w:val="0"/>
-        <w:autoSpaceDN w:val="0"/>
-        <w:adjustRightInd w:val="0"/>
-        <w:jc w:val="left"/>
-      </w:pPr>
-      <w:r>
-        <w:tab/>
-      </w:r>
-      <w:r>
-        <w:tab/>
-      </w:r>
-      <w:r>
-        <w:tab/>
-      </w:r>
-      <w:r>
-        <w:tab/>
-      </w:r>
-      <w:r>
-        <w:tab/>
-      </w:r>
-    </w:p>
-    <w:p>
-      <w:pPr>
-        <w:autoSpaceDE w:val="0"/>
-        <w:autoSpaceDN w:val="0"/>
-        <w:adjustRightInd w:val="0"/>
-        <w:jc w:val="left"/>
-      </w:pPr>
-    </w:p>
-    <w:p>
-      <w:pPr>
-        <w:autoSpaceDE w:val="0"/>
-        <w:autoSpaceDN w:val="0"/>
-        <w:adjustRightInd w:val="0"/>
-        <w:jc w:val="left"/>
-      </w:pPr>
-    </w:p>
-    <w:p>
-      <w:pPr>
-        <w:autoSpaceDE w:val="0"/>
-        <w:autoSpaceDN w:val="0"/>
-        <w:adjustRightInd w:val="0"/>
-        <w:jc w:val="left"/>
-      </w:pPr>
-    </w:p>
-    <w:p>
-      <w:pPr>
-        <w:autoSpaceDE w:val="0"/>
-        <w:autoSpaceDN w:val="0"/>
-        <w:adjustRightInd w:val="0"/>
-        <w:jc w:val="left"/>
-      </w:pPr>
-    </w:p>
-    <w:p>
-      <w:pPr>
-        <w:autoSpaceDE w:val="0"/>
-        <w:autoSpaceDN w:val="0"/>
-        <w:adjustRightInd w:val="0"/>
-        <w:jc w:val="left"/>
-      </w:pPr>
-    </w:p>
     <w:p>
       <w:pPr>
         <w:autoSpaceDE w:val="0"/>

</xml_diff>